<commit_message>
LNenv2 NEW - WER and BLEU working
</commit_message>
<xml_diff>
--- a/info/Project Proposal_LDT3_V1.docx
+++ b/info/Project Proposal_LDT3_V1.docx
@@ -468,8 +468,6 @@
                 <w:lang w:val="en-GB"/>
               </w:rPr>
             </w:pPr>
-            <w:bookmarkStart w:id="0" w:name="_GoBack"/>
-            <w:bookmarkEnd w:id="0"/>
           </w:p>
           <w:p>
             <w:pPr>
@@ -2085,7 +2083,7 @@
           <w:numId w:val="1"/>
         </w:numPr>
       </w:pPr>
-      <w:bookmarkStart w:id="1" w:name="_Toc222220137"/>
+      <w:bookmarkStart w:id="0" w:name="_Toc222220137"/>
       <w:r>
         <w:lastRenderedPageBreak/>
         <w:t>E</w:t>
@@ -2093,7 +2091,7 @@
       <w:r>
         <w:t>xecutive Summary</w:t>
       </w:r>
-      <w:bookmarkEnd w:id="1"/>
+      <w:bookmarkEnd w:id="0"/>
     </w:p>
     <w:p>
       <w:pPr>
@@ -2102,7 +2100,7 @@
           <w:sz w:val="24"/>
         </w:rPr>
       </w:pPr>
-      <w:bookmarkStart w:id="2" w:name="_Hlk18356790"/>
+      <w:bookmarkStart w:id="1" w:name="_Hlk18356790"/>
       <w:r>
         <w:rPr>
           <w:i/>
@@ -2202,7 +2200,7 @@
       <w:r>
         <w:t xml:space="preserve"> Labs models will be used to low latency transcriptions. After all logic is built, designing the website will be the next crucial step. Adding functionality and connecting it to the Jetstream2 GPU allocation and hosting it online will be the last major hurdle but after that the whole project will be functional for use! </w:t>
       </w:r>
-      <w:bookmarkEnd w:id="2"/>
+      <w:bookmarkEnd w:id="1"/>
     </w:p>
     <w:tbl>
       <w:tblPr>
@@ -2300,12 +2298,12 @@
           <w:numId w:val="1"/>
         </w:numPr>
       </w:pPr>
-      <w:bookmarkStart w:id="3" w:name="_Toc222220138"/>
-      <w:bookmarkStart w:id="4" w:name="_Hlk97547012"/>
+      <w:bookmarkStart w:id="2" w:name="_Toc222220138"/>
+      <w:bookmarkStart w:id="3" w:name="_Hlk97547012"/>
       <w:r>
         <w:t>User/Market research</w:t>
       </w:r>
-      <w:bookmarkEnd w:id="3"/>
+      <w:bookmarkEnd w:id="2"/>
     </w:p>
     <w:p>
       <w:pPr>
@@ -2394,13 +2392,13 @@
           <w:numId w:val="1"/>
         </w:numPr>
       </w:pPr>
-      <w:bookmarkStart w:id="5" w:name="_Toc222220139"/>
-      <w:bookmarkEnd w:id="4"/>
+      <w:bookmarkStart w:id="4" w:name="_Toc222220139"/>
+      <w:bookmarkEnd w:id="3"/>
       <w:r>
         <w:lastRenderedPageBreak/>
         <w:t>Product Features</w:t>
       </w:r>
-      <w:bookmarkEnd w:id="5"/>
+      <w:bookmarkEnd w:id="4"/>
     </w:p>
     <w:p>
       <w:pPr>
@@ -2423,7 +2421,7 @@
       <w:pPr>
         <w:pStyle w:val="Heading2"/>
       </w:pPr>
-      <w:bookmarkStart w:id="6" w:name="_Toc222220140"/>
+      <w:bookmarkStart w:id="5" w:name="_Toc222220140"/>
       <w:r>
         <w:t xml:space="preserve">Feature </w:t>
       </w:r>
@@ -2436,7 +2434,7 @@
       <w:r>
         <w:t>Journal</w:t>
       </w:r>
-      <w:bookmarkEnd w:id="6"/>
+      <w:bookmarkEnd w:id="5"/>
       <w:r>
         <w:t xml:space="preserve"> </w:t>
       </w:r>
@@ -2485,7 +2483,7 @@
       <w:pPr>
         <w:pStyle w:val="Heading2"/>
       </w:pPr>
-      <w:bookmarkStart w:id="7" w:name="_Toc222220141"/>
+      <w:bookmarkStart w:id="6" w:name="_Toc222220141"/>
       <w:r>
         <w:t>Feature 2:</w:t>
       </w:r>
@@ -2495,7 +2493,7 @@
       <w:r>
         <w:t>Study Mode</w:t>
       </w:r>
-      <w:bookmarkEnd w:id="7"/>
+      <w:bookmarkEnd w:id="6"/>
     </w:p>
     <w:p>
       <w:pPr>
@@ -2538,11 +2536,11 @@
       <w:pPr>
         <w:pStyle w:val="Heading2"/>
       </w:pPr>
-      <w:bookmarkStart w:id="8" w:name="_Toc222220142"/>
+      <w:bookmarkStart w:id="7" w:name="_Toc222220142"/>
       <w:r>
         <w:t>Feature 3: Real Time Audio Transcription</w:t>
       </w:r>
-      <w:bookmarkEnd w:id="8"/>
+      <w:bookmarkEnd w:id="7"/>
     </w:p>
     <w:p>
       <w:pPr>
@@ -2656,7 +2654,34 @@
                 <w:iCs/>
                 <w:sz w:val="24"/>
               </w:rPr>
-              <w:t>Transcribed (seconds)</w:t>
+              <w:t>Transcribed</w:t>
+            </w:r>
+            <w:r>
+              <w:rPr>
+                <w:b/>
+                <w:i/>
+                <w:iCs/>
+                <w:sz w:val="24"/>
+              </w:rPr>
+              <w:t xml:space="preserve"> CPU</w:t>
+            </w:r>
+            <w:r>
+              <w:rPr>
+                <w:b/>
+                <w:i/>
+                <w:iCs/>
+                <w:sz w:val="24"/>
+              </w:rPr>
+              <w:t xml:space="preserve"> (seconds)</w:t>
+            </w:r>
+            <w:r>
+              <w:rPr>
+                <w:b/>
+                <w:i/>
+                <w:iCs/>
+                <w:sz w:val="24"/>
+              </w:rPr>
+              <w:t xml:space="preserve"> </w:t>
             </w:r>
           </w:p>
         </w:tc>
@@ -2763,21 +2788,32 @@
                 <w:sz w:val="24"/>
               </w:rPr>
             </w:pPr>
-          </w:p>
-        </w:tc>
-        <w:tc>
-          <w:tcPr>
-            <w:tcW w:w="2115" w:type="dxa"/>
-            <w:shd w:val="clear" w:color="auto" w:fill="F2F2F2" w:themeFill="background1" w:themeFillShade="F2"/>
-          </w:tcPr>
-          <w:p>
-            <w:pPr>
+            <w:proofErr w:type="spellStart"/>
+            <w:r>
               <w:rPr>
                 <w:b/>
                 <w:i/>
                 <w:iCs/>
                 <w:sz w:val="24"/>
               </w:rPr>
+              <w:t>na</w:t>
+            </w:r>
+            <w:proofErr w:type="spellEnd"/>
+          </w:p>
+        </w:tc>
+        <w:tc>
+          <w:tcPr>
+            <w:tcW w:w="2115" w:type="dxa"/>
+            <w:shd w:val="clear" w:color="auto" w:fill="F2F2F2" w:themeFill="background1" w:themeFillShade="F2"/>
+          </w:tcPr>
+          <w:p>
+            <w:pPr>
+              <w:rPr>
+                <w:b/>
+                <w:i/>
+                <w:iCs/>
+                <w:sz w:val="24"/>
+              </w:rPr>
             </w:pPr>
           </w:p>
         </w:tc>
@@ -2794,11 +2830,16 @@
       <w:pPr>
         <w:pStyle w:val="Heading2"/>
       </w:pPr>
-      <w:bookmarkStart w:id="9" w:name="_Toc222220143"/>
-      <w:r>
-        <w:t>Feature 4: Cross Language Usage</w:t>
-      </w:r>
+      <w:bookmarkStart w:id="8" w:name="_Toc222220143"/>
+      <w:r>
+        <w:t>Feature 4: Cross L</w:t>
+      </w:r>
+      <w:bookmarkStart w:id="9" w:name="_GoBack"/>
       <w:bookmarkEnd w:id="9"/>
+      <w:r>
+        <w:t>anguage Usage</w:t>
+      </w:r>
+      <w:bookmarkEnd w:id="8"/>
     </w:p>
     <w:p>
       <w:r>
@@ -4291,27 +4332,14 @@
       <w:r>
         <w:t xml:space="preserve">Table </w:t>
       </w:r>
-      <w:r>
-        <w:fldChar w:fldCharType="begin"/>
-      </w:r>
-      <w:r>
-        <w:instrText xml:space="preserve"> SEQ Table \* ARABIC </w:instrText>
-      </w:r>
-      <w:r>
-        <w:fldChar w:fldCharType="separate"/>
-      </w:r>
-      <w:r>
-        <w:rPr>
-          <w:noProof/>
-        </w:rPr>
-        <w:t>1</w:t>
-      </w:r>
-      <w:r>
-        <w:rPr>
-          <w:noProof/>
-        </w:rPr>
-        <w:fldChar w:fldCharType="end"/>
-      </w:r>
+      <w:fldSimple w:instr=" SEQ Table \* ARABIC ">
+        <w:r>
+          <w:rPr>
+            <w:noProof/>
+          </w:rPr>
+          <w:t>1</w:t>
+        </w:r>
+      </w:fldSimple>
       <w:r>
         <w:t>: Milestone Schedule</w:t>
       </w:r>
@@ -9532,7 +9560,7 @@
                   <v:path o:extrusionok="f" gradientshapeok="t" o:connecttype="rect"/>
                   <o:lock v:ext="edit" aspectratio="t"/>
                 </v:shapetype>
-                <v:shape id="_x0000_i1025" type="#_x0000_t75" alt="Microsoft Office Signature Line..." style="width:3.3pt;height:11.1pt">
+                <v:shape id="_x0000_i1025" type="#_x0000_t75" alt="Microsoft Office Signature Line..." style="width:3pt;height:11.25pt">
                   <v:imagedata r:id="rId11" o:title=""/>
                   <o:lock v:ext="edit" ungrouping="t" rotation="t" cropping="t" verticies="t" text="t" grouping="t"/>
                   <o:signatureline v:ext="edit" id="{F032D24A-56E4-4002-9727-8470AAB6A6D3}" provid="{00000000-0000-0000-0000-000000000000}" showsigndate="f" allowcomments="t" issignatureline="t"/>
@@ -15527,14 +15555,12 @@
 </file>
 
 <file path=customXml/item1.xml><?xml version="1.0" encoding="utf-8"?>
-<p:properties xmlns:p="http://schemas.microsoft.com/office/2006/metadata/properties" xmlns:xsi="http://www.w3.org/2001/XMLSchema-instance" xmlns:pc="http://schemas.microsoft.com/office/infopath/2007/PartnerControls">
-  <documentManagement>
-    <TaxCatchAll xmlns="77e6d9d7-eee8-4935-8fa9-6c847c8ed84c" xsi:nil="true"/>
-    <lcf76f155ced4ddcb4097134ff3c332f xmlns="3432595d-a858-4562-974d-a58e068ae362">
-      <Terms xmlns="http://schemas.microsoft.com/office/infopath/2007/PartnerControls"/>
-    </lcf76f155ced4ddcb4097134ff3c332f>
-  </documentManagement>
-</p:properties>
+<?mso-contentType ?>
+<FormTemplates xmlns="http://schemas.microsoft.com/sharepoint/v3/contenttype/forms">
+  <Display>DocumentLibraryForm</Display>
+  <Edit>DocumentLibraryForm</Edit>
+  <New>DocumentLibraryForm</New>
+</FormTemplates>
 </file>
 
 <file path=customXml/item2.xml><?xml version="1.0" encoding="utf-8"?>
@@ -15733,12 +15759,14 @@
 </file>
 
 <file path=customXml/item3.xml><?xml version="1.0" encoding="utf-8"?>
-<?mso-contentType ?>
-<FormTemplates xmlns="http://schemas.microsoft.com/sharepoint/v3/contenttype/forms">
-  <Display>DocumentLibraryForm</Display>
-  <Edit>DocumentLibraryForm</Edit>
-  <New>DocumentLibraryForm</New>
-</FormTemplates>
+<p:properties xmlns:p="http://schemas.microsoft.com/office/2006/metadata/properties" xmlns:xsi="http://www.w3.org/2001/XMLSchema-instance" xmlns:pc="http://schemas.microsoft.com/office/infopath/2007/PartnerControls">
+  <documentManagement>
+    <TaxCatchAll xmlns="77e6d9d7-eee8-4935-8fa9-6c847c8ed84c" xsi:nil="true"/>
+    <lcf76f155ced4ddcb4097134ff3c332f xmlns="3432595d-a858-4562-974d-a58e068ae362">
+      <Terms xmlns="http://schemas.microsoft.com/office/infopath/2007/PartnerControls"/>
+    </lcf76f155ced4ddcb4097134ff3c332f>
+  </documentManagement>
+</p:properties>
 </file>
 
 <file path=customXml/item4.xml><?xml version="1.0" encoding="utf-8"?>
@@ -15746,12 +15774,9 @@
 </file>
 
 <file path=customXml/itemProps1.xml><?xml version="1.0" encoding="utf-8"?>
-<ds:datastoreItem xmlns:ds="http://schemas.openxmlformats.org/officeDocument/2006/customXml" ds:itemID="{A4FB9575-2617-4E21-9B88-269BD66A366D}">
+<ds:datastoreItem xmlns:ds="http://schemas.openxmlformats.org/officeDocument/2006/customXml" ds:itemID="{BCB54D9D-645D-4BAD-B828-CDD19DDBFDB2}">
   <ds:schemaRefs>
-    <ds:schemaRef ds:uri="http://schemas.microsoft.com/office/2006/metadata/properties"/>
-    <ds:schemaRef ds:uri="http://schemas.microsoft.com/office/infopath/2007/PartnerControls"/>
-    <ds:schemaRef ds:uri="77e6d9d7-eee8-4935-8fa9-6c847c8ed84c"/>
-    <ds:schemaRef ds:uri="3432595d-a858-4562-974d-a58e068ae362"/>
+    <ds:schemaRef ds:uri="http://schemas.microsoft.com/sharepoint/v3/contenttype/forms"/>
   </ds:schemaRefs>
 </ds:datastoreItem>
 </file>
@@ -15776,15 +15801,18 @@
 </file>
 
 <file path=customXml/itemProps3.xml><?xml version="1.0" encoding="utf-8"?>
-<ds:datastoreItem xmlns:ds="http://schemas.openxmlformats.org/officeDocument/2006/customXml" ds:itemID="{BCB54D9D-645D-4BAD-B828-CDD19DDBFDB2}">
+<ds:datastoreItem xmlns:ds="http://schemas.openxmlformats.org/officeDocument/2006/customXml" ds:itemID="{A4FB9575-2617-4E21-9B88-269BD66A366D}">
   <ds:schemaRefs>
-    <ds:schemaRef ds:uri="http://schemas.microsoft.com/sharepoint/v3/contenttype/forms"/>
+    <ds:schemaRef ds:uri="http://schemas.microsoft.com/office/2006/metadata/properties"/>
+    <ds:schemaRef ds:uri="http://schemas.microsoft.com/office/infopath/2007/PartnerControls"/>
+    <ds:schemaRef ds:uri="77e6d9d7-eee8-4935-8fa9-6c847c8ed84c"/>
+    <ds:schemaRef ds:uri="3432595d-a858-4562-974d-a58e068ae362"/>
   </ds:schemaRefs>
 </ds:datastoreItem>
 </file>
 
 <file path=customXml/itemProps4.xml><?xml version="1.0" encoding="utf-8"?>
-<ds:datastoreItem xmlns:ds="http://schemas.openxmlformats.org/officeDocument/2006/customXml" ds:itemID="{EAB72AA2-1076-4BA6-BA57-43F4694FAA19}">
+<ds:datastoreItem xmlns:ds="http://schemas.openxmlformats.org/officeDocument/2006/customXml" ds:itemID="{9EA347F0-739C-4688-A129-EE164B41204D}">
   <ds:schemaRefs>
     <ds:schemaRef ds:uri="http://schemas.openxmlformats.org/officeDocument/2006/bibliography"/>
   </ds:schemaRefs>

</xml_diff>